<commit_message>
Improve static map basemap: cartographic fallback + EPSG:4326 coords
- Rework _add_basemap() to use contextily with crs parameter,
  properly supporting EPSG:4326 (lat/lon) coordinates
- When tiles are available (internet access): renders CartoDB Positron
  basemap showing full road network background
- When offline: professional cartographic fallback with styled
  background, coordinate grid, lat/lon axis labels, and road-bed
  shadow for visual context
- Keep maps in EPSG:4326 for readable lat/lon coordinates in the
  offline fallback (contextily handles reprojection internally)
- Regenerate all 15 static maps and Word report with updated styling

https://claude.ai/code/session_01C9yS1ptJzWrM5YXS1NsW3z
</commit_message>
<xml_diff>
--- a/output/report_corso_francia.docx
+++ b/output/report_corso_francia.docx
@@ -4143,7 +4143,7 @@
       <w:r>
         <w:drawing>
           <wp:inline xmlns:a="http://schemas.openxmlformats.org/drawingml/2006/main" xmlns:pic="http://schemas.openxmlformats.org/drawingml/2006/picture">
-            <wp:extent cx="5943600" cy="5757468"/>
+            <wp:extent cx="5943600" cy="5754414"/>
             <wp:docPr id="13" name="Picture 13"/>
             <wp:cNvGraphicFramePr>
               <a:graphicFrameLocks noChangeAspect="1"/>
@@ -4164,7 +4164,7 @@
                   <pic:spPr>
                     <a:xfrm>
                       <a:off x="0" y="0"/>
-                      <a:ext cx="5943600" cy="5757468"/>
+                      <a:ext cx="5943600" cy="5754414"/>
                     </a:xfrm>
                     <a:prstGeom prst="rect"/>
                   </pic:spPr>
@@ -4389,7 +4389,7 @@
       <w:r>
         <w:drawing>
           <wp:inline xmlns:a="http://schemas.openxmlformats.org/drawingml/2006/main" xmlns:pic="http://schemas.openxmlformats.org/drawingml/2006/picture">
-            <wp:extent cx="5943600" cy="14328895"/>
+            <wp:extent cx="5943600" cy="14137843"/>
             <wp:docPr id="18" name="Picture 18"/>
             <wp:cNvGraphicFramePr>
               <a:graphicFrameLocks noChangeAspect="1"/>
@@ -4410,7 +4410,7 @@
                   <pic:spPr>
                     <a:xfrm>
                       <a:off x="0" y="0"/>
-                      <a:ext cx="5943600" cy="14328895"/>
+                      <a:ext cx="5943600" cy="14137843"/>
                     </a:xfrm>
                     <a:prstGeom prst="rect"/>
                   </pic:spPr>
@@ -4534,7 +4534,7 @@
       <w:r>
         <w:drawing>
           <wp:inline xmlns:a="http://schemas.openxmlformats.org/drawingml/2006/main" xmlns:pic="http://schemas.openxmlformats.org/drawingml/2006/picture">
-            <wp:extent cx="5943600" cy="13122998"/>
+            <wp:extent cx="5943600" cy="13204710"/>
             <wp:docPr id="21" name="Picture 21"/>
             <wp:cNvGraphicFramePr>
               <a:graphicFrameLocks noChangeAspect="1"/>
@@ -4555,7 +4555,7 @@
                   <pic:spPr>
                     <a:xfrm>
                       <a:off x="0" y="0"/>
-                      <a:ext cx="5943600" cy="13122998"/>
+                      <a:ext cx="5943600" cy="13204710"/>
                     </a:xfrm>
                     <a:prstGeom prst="rect"/>
                   </pic:spPr>
@@ -4679,7 +4679,7 @@
       <w:r>
         <w:drawing>
           <wp:inline xmlns:a="http://schemas.openxmlformats.org/drawingml/2006/main" xmlns:pic="http://schemas.openxmlformats.org/drawingml/2006/picture">
-            <wp:extent cx="5943600" cy="14605210"/>
+            <wp:extent cx="5943600" cy="14137843"/>
             <wp:docPr id="24" name="Picture 24"/>
             <wp:cNvGraphicFramePr>
               <a:graphicFrameLocks noChangeAspect="1"/>
@@ -4700,7 +4700,7 @@
                   <pic:spPr>
                     <a:xfrm>
                       <a:off x="0" y="0"/>
-                      <a:ext cx="5943600" cy="14605210"/>
+                      <a:ext cx="5943600" cy="14137843"/>
                     </a:xfrm>
                     <a:prstGeom prst="rect"/>
                   </pic:spPr>
@@ -4723,7 +4723,7 @@
       <w:r>
         <w:drawing>
           <wp:inline xmlns:a="http://schemas.openxmlformats.org/drawingml/2006/main" xmlns:pic="http://schemas.openxmlformats.org/drawingml/2006/picture">
-            <wp:extent cx="5943600" cy="5911210"/>
+            <wp:extent cx="5943600" cy="5907990"/>
             <wp:docPr id="25" name="Picture 25"/>
             <wp:cNvGraphicFramePr>
               <a:graphicFrameLocks noChangeAspect="1"/>
@@ -4744,7 +4744,7 @@
                   <pic:spPr>
                     <a:xfrm>
                       <a:off x="0" y="0"/>
-                      <a:ext cx="5943600" cy="5911210"/>
+                      <a:ext cx="5943600" cy="5907990"/>
                     </a:xfrm>
                     <a:prstGeom prst="rect"/>
                   </pic:spPr>
@@ -4824,7 +4824,7 @@
       <w:r>
         <w:drawing>
           <wp:inline xmlns:a="http://schemas.openxmlformats.org/drawingml/2006/main" xmlns:pic="http://schemas.openxmlformats.org/drawingml/2006/picture">
-            <wp:extent cx="5943600" cy="13646567"/>
+            <wp:extent cx="5943600" cy="13752766"/>
             <wp:docPr id="27" name="Picture 27"/>
             <wp:cNvGraphicFramePr>
               <a:graphicFrameLocks noChangeAspect="1"/>
@@ -4845,7 +4845,7 @@
                   <pic:spPr>
                     <a:xfrm>
                       <a:off x="0" y="0"/>
-                      <a:ext cx="5943600" cy="13646567"/>
+                      <a:ext cx="5943600" cy="13752766"/>
                     </a:xfrm>
                     <a:prstGeom prst="rect"/>
                   </pic:spPr>

</xml_diff>